<commit_message>
Update Word template font to Noto Sans SC
</commit_message>
<xml_diff>
--- a/template/resume-portfolio-content-template-general.docx
+++ b/template/resume-portfolio-content-template-general.docx
@@ -98,12 +98,6 @@
             <w:insideH w:val="single" w:color="D9D9D9" w:sz="6" w:space="0"/>
             <w:insideV w:val="single" w:color="D9D9D9" w:sz="6" w:space="0"/>
           </w:tblBorders>
-          <w:tblCellMar>
-            <w:top w:w="0" w:type="dxa"/>
-            <w:left w:w="108" w:type="dxa"/>
-            <w:bottom w:w="0" w:type="dxa"/>
-            <w:right w:w="108" w:type="dxa"/>
-          </w:tblCellMar>
         </w:tblPrEx>
         <w:trPr>
           <w:jc w:val="center"/>
@@ -4176,6 +4170,9 @@
         </w:rPr>
       </w:pPr>
       <w:r>
+        <w:rPr>
+          <w:rFonts w:hint="eastAsia" w:ascii="Noto Sans SC" w:hAnsi="Noto Sans SC" w:eastAsia="Noto Sans SC" w:cs="Noto Sans SC"/>
+        </w:rPr>
         <w:t>三 通用模块一 项目与实践</w:t>
       </w:r>
     </w:p>
@@ -4187,6 +4184,9 @@
         </w:rPr>
       </w:pPr>
       <w:r>
+        <w:rPr>
+          <w:rFonts w:hint="eastAsia" w:ascii="Noto Sans SC" w:hAnsi="Noto Sans SC" w:eastAsia="Noto Sans SC" w:cs="Noto Sans SC"/>
+        </w:rPr>
         <w:t>先由 Agent 按 CV 归纳 1 个主模块，填 4 个条目。可改为项目经历、客户案例、专业实践、研究或论文；每条尽量包含时间、职责、行动和可核实结果。</w:t>
       </w:r>
     </w:p>
@@ -4373,7 +4373,7 @@
                 <w:color w:val="334155"/>
                 <w:sz w:val="17"/>
               </w:rPr>
-              <w:t xml:space="preserve">通用模块一</w:t>
+              <w:t>通用模块一</w:t>
             </w:r>
           </w:p>
         </w:tc>
@@ -4396,7 +4396,7 @@
                 <w:color w:val="0F4C5C"/>
                 <w:sz w:val="17"/>
               </w:rPr>
-              <w:t xml:space="preserve">modules[0].type</w:t>
+              <w:t>modules[0].type</w:t>
             </w:r>
           </w:p>
         </w:tc>
@@ -4418,7 +4418,7 @@
                 <w:sz w:val="18"/>
                 <w:highlight w:val="yellow"/>
               </w:rPr>
-              <w:t xml:space="preserve">[在此填写：modules[0].type]</w:t>
+              <w:t>[在此填写：modules[0].type]</w:t>
             </w:r>
           </w:p>
         </w:tc>
@@ -4441,7 +4441,7 @@
                 <w:color w:val="64748B"/>
                 <w:sz w:val="16"/>
               </w:rPr>
-              <w:t xml:space="preserve">模块类型：project / portfolio / award / practice / research / publication</w:t>
+              <w:t>模块类型：project / portfolio / award / practice / research / publication</w:t>
             </w:r>
           </w:p>
         </w:tc>
@@ -4486,7 +4486,7 @@
                 <w:color w:val="334155"/>
                 <w:sz w:val="17"/>
               </w:rPr>
-              <w:t xml:space="preserve">通用模块一</w:t>
+              <w:t>通用模块一</w:t>
             </w:r>
           </w:p>
         </w:tc>
@@ -4510,7 +4510,7 @@
                 <w:color w:val="0F4C5C"/>
                 <w:sz w:val="17"/>
               </w:rPr>
-              <w:t xml:space="preserve">modules[0].intro</w:t>
+              <w:t>modules[0].intro</w:t>
             </w:r>
           </w:p>
         </w:tc>
@@ -4533,7 +4533,7 @@
                 <w:sz w:val="18"/>
                 <w:highlight w:val="yellow"/>
               </w:rPr>
-              <w:t xml:space="preserve">[在此填写：modules[0].intro]</w:t>
+              <w:t>[在此填写：modules[0].intro]</w:t>
             </w:r>
           </w:p>
         </w:tc>
@@ -4557,7 +4557,7 @@
                 <w:color w:val="64748B"/>
                 <w:sz w:val="16"/>
               </w:rPr>
-              <w:t xml:space="preserve">用一两句话概括此模块的价值；中英文均可先填一种</w:t>
+              <w:t>用一两句话概括此模块的价值；中英文均可先填一种</w:t>
             </w:r>
           </w:p>
         </w:tc>
@@ -4601,7 +4601,7 @@
                 <w:color w:val="334155"/>
                 <w:sz w:val="17"/>
               </w:rPr>
-              <w:t xml:space="preserve">模块一 条目 1</w:t>
+              <w:t>模块一 条目 1</w:t>
             </w:r>
           </w:p>
         </w:tc>
@@ -4624,7 +4624,7 @@
                 <w:color w:val="0F4C5C"/>
                 <w:sz w:val="17"/>
               </w:rPr>
-              <w:t xml:space="preserve">modules[0].items[0].date</w:t>
+              <w:t>modules[0].items[0].date</w:t>
             </w:r>
           </w:p>
         </w:tc>
@@ -4646,7 +4646,7 @@
                 <w:sz w:val="18"/>
                 <w:highlight w:val="yellow"/>
               </w:rPr>
-              <w:t xml:space="preserve">[在此填写：modules[0].items[0].date]</w:t>
+              <w:t>[在此填写：modules[0].items[0].date]</w:t>
             </w:r>
           </w:p>
         </w:tc>
@@ -4669,7 +4669,7 @@
                 <w:color w:val="64748B"/>
                 <w:sz w:val="16"/>
               </w:rPr>
-              <w:t xml:space="preserve">时间 / 阶段</w:t>
+              <w:t>时间 / 阶段</w:t>
             </w:r>
           </w:p>
         </w:tc>
@@ -4714,7 +4714,7 @@
                 <w:color w:val="334155"/>
                 <w:sz w:val="17"/>
               </w:rPr>
-              <w:t xml:space="preserve">模块一 条目 1</w:t>
+              <w:t>模块一 条目 1</w:t>
             </w:r>
           </w:p>
         </w:tc>
@@ -4738,7 +4738,7 @@
                 <w:color w:val="0F4C5C"/>
                 <w:sz w:val="17"/>
               </w:rPr>
-              <w:t xml:space="preserve">modules[0].items[0].title</w:t>
+              <w:t>modules[0].items[0].title</w:t>
             </w:r>
           </w:p>
         </w:tc>
@@ -4761,7 +4761,7 @@
                 <w:sz w:val="18"/>
                 <w:highlight w:val="yellow"/>
               </w:rPr>
-              <w:t xml:space="preserve">[在此填写：modules[0].items[0].title]</w:t>
+              <w:t>[在此填写：modules[0].items[0].title]</w:t>
             </w:r>
           </w:p>
         </w:tc>
@@ -4785,7 +4785,7 @@
                 <w:color w:val="64748B"/>
                 <w:sz w:val="16"/>
               </w:rPr>
-              <w:t xml:space="preserve">项目 / 角色名称</w:t>
+              <w:t>项目 / 角色名称</w:t>
             </w:r>
           </w:p>
         </w:tc>
@@ -4829,7 +4829,7 @@
                 <w:color w:val="334155"/>
                 <w:sz w:val="17"/>
               </w:rPr>
-              <w:t xml:space="preserve">模块一 条目 1</w:t>
+              <w:t>模块一 条目 1</w:t>
             </w:r>
           </w:p>
         </w:tc>
@@ -4852,7 +4852,7 @@
                 <w:color w:val="0F4C5C"/>
                 <w:sz w:val="17"/>
               </w:rPr>
-              <w:t xml:space="preserve">modules[0].items[0].summaryZh</w:t>
+              <w:t>modules[0].items[0].summaryZh</w:t>
             </w:r>
           </w:p>
         </w:tc>
@@ -4874,7 +4874,7 @@
                 <w:sz w:val="18"/>
                 <w:highlight w:val="yellow"/>
               </w:rPr>
-              <w:t xml:space="preserve">[在此填写：modules[0].items[0].summaryZh]</w:t>
+              <w:t>[在此填写：modules[0].items[0].summaryZh]</w:t>
             </w:r>
           </w:p>
         </w:tc>
@@ -4897,7 +4897,7 @@
                 <w:color w:val="64748B"/>
                 <w:sz w:val="16"/>
               </w:rPr>
-              <w:t xml:space="preserve">背景、职责与关键行动</w:t>
+              <w:t>背景、职责与关键行动</w:t>
             </w:r>
           </w:p>
         </w:tc>
@@ -4942,7 +4942,7 @@
                 <w:color w:val="334155"/>
                 <w:sz w:val="17"/>
               </w:rPr>
-              <w:t xml:space="preserve">模块一 条目 1</w:t>
+              <w:t>模块一 条目 1</w:t>
             </w:r>
           </w:p>
         </w:tc>
@@ -4966,7 +4966,7 @@
                 <w:color w:val="0F4C5C"/>
                 <w:sz w:val="17"/>
               </w:rPr>
-              <w:t xml:space="preserve">modules[0].items[0].summaryEn</w:t>
+              <w:t>modules[0].items[0].summaryEn</w:t>
             </w:r>
           </w:p>
         </w:tc>
@@ -4989,7 +4989,7 @@
                 <w:sz w:val="18"/>
                 <w:highlight w:val="yellow"/>
               </w:rPr>
-              <w:t xml:space="preserve">[在此填写：modules[0].items[0].summaryEn]</w:t>
+              <w:t>[在此填写：modules[0].items[0].summaryEn]</w:t>
             </w:r>
           </w:p>
         </w:tc>
@@ -5013,7 +5013,7 @@
                 <w:color w:val="64748B"/>
                 <w:sz w:val="16"/>
               </w:rPr>
-              <w:t xml:space="preserve">English summary; translate only supported facts</w:t>
+              <w:t>English summary; translate only supported facts</w:t>
             </w:r>
           </w:p>
         </w:tc>
@@ -5057,7 +5057,7 @@
                 <w:color w:val="334155"/>
                 <w:sz w:val="17"/>
               </w:rPr>
-              <w:t xml:space="preserve">模块一 条目 1</w:t>
+              <w:t>模块一 条目 1</w:t>
             </w:r>
           </w:p>
         </w:tc>
@@ -5080,7 +5080,7 @@
                 <w:color w:val="0F4C5C"/>
                 <w:sz w:val="17"/>
               </w:rPr>
-              <w:t xml:space="preserve">modules[0].items[0].evidence</w:t>
+              <w:t>modules[0].items[0].evidence</w:t>
             </w:r>
           </w:p>
         </w:tc>
@@ -5102,7 +5102,7 @@
                 <w:sz w:val="18"/>
                 <w:highlight w:val="yellow"/>
               </w:rPr>
-              <w:t xml:space="preserve">[在此填写：modules[0].items[0].evidence]</w:t>
+              <w:t>[在此填写：modules[0].items[0].evidence]</w:t>
             </w:r>
           </w:p>
         </w:tc>
@@ -5125,7 +5125,7 @@
                 <w:color w:val="64748B"/>
                 <w:sz w:val="16"/>
               </w:rPr>
-              <w:t xml:space="preserve">结果、数据或可核实证据</w:t>
+              <w:t>结果、数据或可核实证据</w:t>
             </w:r>
           </w:p>
         </w:tc>
@@ -5170,7 +5170,7 @@
                 <w:color w:val="334155"/>
                 <w:sz w:val="17"/>
               </w:rPr>
-              <w:t xml:space="preserve">模块一 条目 2</w:t>
+              <w:t>模块一 条目 2</w:t>
             </w:r>
           </w:p>
         </w:tc>
@@ -5194,7 +5194,7 @@
                 <w:color w:val="0F4C5C"/>
                 <w:sz w:val="17"/>
               </w:rPr>
-              <w:t xml:space="preserve">modules[0].items[1].date</w:t>
+              <w:t>modules[0].items[1].date</w:t>
             </w:r>
           </w:p>
         </w:tc>
@@ -5217,7 +5217,7 @@
                 <w:sz w:val="18"/>
                 <w:highlight w:val="yellow"/>
               </w:rPr>
-              <w:t xml:space="preserve">[在此填写：modules[0].items[1].date]</w:t>
+              <w:t>[在此填写：modules[0].items[1].date]</w:t>
             </w:r>
           </w:p>
         </w:tc>
@@ -5241,7 +5241,7 @@
                 <w:color w:val="64748B"/>
                 <w:sz w:val="16"/>
               </w:rPr>
-              <w:t xml:space="preserve">时间 / 阶段</w:t>
+              <w:t>时间 / 阶段</w:t>
             </w:r>
           </w:p>
         </w:tc>
@@ -5285,7 +5285,7 @@
                 <w:color w:val="334155"/>
                 <w:sz w:val="17"/>
               </w:rPr>
-              <w:t xml:space="preserve">模块一 条目 2</w:t>
+              <w:t>模块一 条目 2</w:t>
             </w:r>
           </w:p>
         </w:tc>
@@ -5308,7 +5308,7 @@
                 <w:color w:val="0F4C5C"/>
                 <w:sz w:val="17"/>
               </w:rPr>
-              <w:t xml:space="preserve">modules[0].items[1].title</w:t>
+              <w:t>modules[0].items[1].title</w:t>
             </w:r>
           </w:p>
         </w:tc>
@@ -5330,7 +5330,7 @@
                 <w:sz w:val="18"/>
                 <w:highlight w:val="yellow"/>
               </w:rPr>
-              <w:t xml:space="preserve">[在此填写：modules[0].items[1].title]</w:t>
+              <w:t>[在此填写：modules[0].items[1].title]</w:t>
             </w:r>
           </w:p>
         </w:tc>
@@ -5353,7 +5353,7 @@
                 <w:color w:val="64748B"/>
                 <w:sz w:val="16"/>
               </w:rPr>
-              <w:t xml:space="preserve">项目 / 角色名称</w:t>
+              <w:t>项目 / 角色名称</w:t>
             </w:r>
           </w:p>
         </w:tc>
@@ -5398,7 +5398,7 @@
                 <w:color w:val="334155"/>
                 <w:sz w:val="17"/>
               </w:rPr>
-              <w:t xml:space="preserve">模块一 条目 2</w:t>
+              <w:t>模块一 条目 2</w:t>
             </w:r>
           </w:p>
         </w:tc>
@@ -5422,7 +5422,7 @@
                 <w:color w:val="0F4C5C"/>
                 <w:sz w:val="17"/>
               </w:rPr>
-              <w:t xml:space="preserve">modules[0].items[1].summaryZh</w:t>
+              <w:t>modules[0].items[1].summaryZh</w:t>
             </w:r>
           </w:p>
         </w:tc>
@@ -5445,7 +5445,7 @@
                 <w:sz w:val="18"/>
                 <w:highlight w:val="yellow"/>
               </w:rPr>
-              <w:t xml:space="preserve">[在此填写：modules[0].items[1].summaryZh]</w:t>
+              <w:t>[在此填写：modules[0].items[1].summaryZh]</w:t>
             </w:r>
           </w:p>
         </w:tc>
@@ -5469,7 +5469,7 @@
                 <w:color w:val="64748B"/>
                 <w:sz w:val="16"/>
               </w:rPr>
-              <w:t xml:space="preserve">背景、职责与关键行动</w:t>
+              <w:t>背景、职责与关键行动</w:t>
             </w:r>
           </w:p>
         </w:tc>
@@ -5513,7 +5513,7 @@
                 <w:color w:val="334155"/>
                 <w:sz w:val="17"/>
               </w:rPr>
-              <w:t xml:space="preserve">模块一 条目 2</w:t>
+              <w:t>模块一 条目 2</w:t>
             </w:r>
           </w:p>
         </w:tc>
@@ -5536,7 +5536,7 @@
                 <w:color w:val="0F4C5C"/>
                 <w:sz w:val="17"/>
               </w:rPr>
-              <w:t xml:space="preserve">modules[0].items[1].summaryEn</w:t>
+              <w:t>modules[0].items[1].summaryEn</w:t>
             </w:r>
           </w:p>
         </w:tc>
@@ -5558,7 +5558,7 @@
                 <w:sz w:val="18"/>
                 <w:highlight w:val="yellow"/>
               </w:rPr>
-              <w:t xml:space="preserve">[在此填写：modules[0].items[1].summaryEn]</w:t>
+              <w:t>[在此填写：modules[0].items[1].summaryEn]</w:t>
             </w:r>
           </w:p>
         </w:tc>
@@ -5581,7 +5581,7 @@
                 <w:color w:val="64748B"/>
                 <w:sz w:val="16"/>
               </w:rPr>
-              <w:t xml:space="preserve">English summary; translate only supported facts</w:t>
+              <w:t>English summary; translate only supported facts</w:t>
             </w:r>
           </w:p>
         </w:tc>
@@ -5626,7 +5626,7 @@
                 <w:color w:val="334155"/>
                 <w:sz w:val="17"/>
               </w:rPr>
-              <w:t xml:space="preserve">模块一 条目 2</w:t>
+              <w:t>模块一 条目 2</w:t>
             </w:r>
           </w:p>
         </w:tc>
@@ -5650,7 +5650,7 @@
                 <w:color w:val="0F4C5C"/>
                 <w:sz w:val="17"/>
               </w:rPr>
-              <w:t xml:space="preserve">modules[0].items[1].evidence</w:t>
+              <w:t>modules[0].items[1].evidence</w:t>
             </w:r>
           </w:p>
         </w:tc>
@@ -5673,7 +5673,7 @@
                 <w:sz w:val="18"/>
                 <w:highlight w:val="yellow"/>
               </w:rPr>
-              <w:t xml:space="preserve">[在此填写：modules[0].items[1].evidence]</w:t>
+              <w:t>[在此填写：modules[0].items[1].evidence]</w:t>
             </w:r>
           </w:p>
         </w:tc>
@@ -5697,7 +5697,7 @@
                 <w:color w:val="64748B"/>
                 <w:sz w:val="16"/>
               </w:rPr>
-              <w:t xml:space="preserve">结果、数据或可核实证据</w:t>
+              <w:t>结果、数据或可核实证据</w:t>
             </w:r>
           </w:p>
         </w:tc>
@@ -5741,7 +5741,7 @@
                 <w:color w:val="334155"/>
                 <w:sz w:val="17"/>
               </w:rPr>
-              <w:t xml:space="preserve">模块一 条目 3</w:t>
+              <w:t>模块一 条目 3</w:t>
             </w:r>
           </w:p>
         </w:tc>
@@ -5764,7 +5764,7 @@
                 <w:color w:val="0F4C5C"/>
                 <w:sz w:val="17"/>
               </w:rPr>
-              <w:t xml:space="preserve">modules[0].items[2].date</w:t>
+              <w:t>modules[0].items[2].date</w:t>
             </w:r>
           </w:p>
         </w:tc>
@@ -5786,7 +5786,7 @@
                 <w:sz w:val="18"/>
                 <w:highlight w:val="yellow"/>
               </w:rPr>
-              <w:t xml:space="preserve">[在此填写：modules[0].items[2].date]</w:t>
+              <w:t>[在此填写：modules[0].items[2].date]</w:t>
             </w:r>
           </w:p>
         </w:tc>
@@ -5809,7 +5809,7 @@
                 <w:color w:val="64748B"/>
                 <w:sz w:val="16"/>
               </w:rPr>
-              <w:t xml:space="preserve">时间 / 阶段</w:t>
+              <w:t>时间 / 阶段</w:t>
             </w:r>
           </w:p>
         </w:tc>
@@ -5854,7 +5854,7 @@
                 <w:color w:val="334155"/>
                 <w:sz w:val="17"/>
               </w:rPr>
-              <w:t xml:space="preserve">模块一 条目 3</w:t>
+              <w:t>模块一 条目 3</w:t>
             </w:r>
           </w:p>
         </w:tc>
@@ -5878,7 +5878,7 @@
                 <w:color w:val="0F4C5C"/>
                 <w:sz w:val="17"/>
               </w:rPr>
-              <w:t xml:space="preserve">modules[0].items[2].title</w:t>
+              <w:t>modules[0].items[2].title</w:t>
             </w:r>
           </w:p>
         </w:tc>
@@ -5901,7 +5901,7 @@
                 <w:sz w:val="18"/>
                 <w:highlight w:val="yellow"/>
               </w:rPr>
-              <w:t xml:space="preserve">[在此填写：modules[0].items[2].title]</w:t>
+              <w:t>[在此填写：modules[0].items[2].title]</w:t>
             </w:r>
           </w:p>
         </w:tc>
@@ -5925,8 +5925,10 @@
                 <w:color w:val="64748B"/>
                 <w:sz w:val="16"/>
               </w:rPr>
-              <w:t xml:space="preserve">项目 / 角色名称</w:t>
-            </w:r>
+              <w:t>项目 / 角色名称</w:t>
+            </w:r>
+            <w:bookmarkStart w:id="0" w:name="_GoBack"/>
+            <w:bookmarkEnd w:id="0"/>
           </w:p>
         </w:tc>
       </w:tr>
@@ -5969,7 +5971,7 @@
                 <w:color w:val="334155"/>
                 <w:sz w:val="17"/>
               </w:rPr>
-              <w:t xml:space="preserve">模块一 条目 3</w:t>
+              <w:t>模块一 条目 3</w:t>
             </w:r>
           </w:p>
         </w:tc>
@@ -5992,7 +5994,7 @@
                 <w:color w:val="0F4C5C"/>
                 <w:sz w:val="17"/>
               </w:rPr>
-              <w:t xml:space="preserve">modules[0].items[2].summaryZh</w:t>
+              <w:t>modules[0].items[2].summaryZh</w:t>
             </w:r>
           </w:p>
         </w:tc>
@@ -6014,7 +6016,7 @@
                 <w:sz w:val="18"/>
                 <w:highlight w:val="yellow"/>
               </w:rPr>
-              <w:t xml:space="preserve">[在此填写：modules[0].items[2].summaryZh]</w:t>
+              <w:t>[在此填写：modules[0].items[2].summaryZh]</w:t>
             </w:r>
           </w:p>
         </w:tc>
@@ -6037,7 +6039,7 @@
                 <w:color w:val="64748B"/>
                 <w:sz w:val="16"/>
               </w:rPr>
-              <w:t xml:space="preserve">背景、职责与关键行动</w:t>
+              <w:t>背景、职责与关键行动</w:t>
             </w:r>
           </w:p>
         </w:tc>
@@ -6082,7 +6084,7 @@
                 <w:color w:val="334155"/>
                 <w:sz w:val="17"/>
               </w:rPr>
-              <w:t xml:space="preserve">模块一 条目 3</w:t>
+              <w:t>模块一 条目 3</w:t>
             </w:r>
           </w:p>
         </w:tc>
@@ -6106,7 +6108,7 @@
                 <w:color w:val="0F4C5C"/>
                 <w:sz w:val="17"/>
               </w:rPr>
-              <w:t xml:space="preserve">modules[0].items[2].summaryEn</w:t>
+              <w:t>modules[0].items[2].summaryEn</w:t>
             </w:r>
           </w:p>
         </w:tc>
@@ -6129,7 +6131,7 @@
                 <w:sz w:val="18"/>
                 <w:highlight w:val="yellow"/>
               </w:rPr>
-              <w:t xml:space="preserve">[在此填写：modules[0].items[2].summaryEn]</w:t>
+              <w:t>[在此填写：modules[0].items[2].summaryEn]</w:t>
             </w:r>
           </w:p>
         </w:tc>
@@ -6153,7 +6155,7 @@
                 <w:color w:val="64748B"/>
                 <w:sz w:val="16"/>
               </w:rPr>
-              <w:t xml:space="preserve">English summary; translate only supported facts</w:t>
+              <w:t>English summary; translate only supported facts</w:t>
             </w:r>
           </w:p>
         </w:tc>
@@ -6197,7 +6199,7 @@
                 <w:color w:val="334155"/>
                 <w:sz w:val="17"/>
               </w:rPr>
-              <w:t xml:space="preserve">模块一 条目 3</w:t>
+              <w:t>模块一 条目 3</w:t>
             </w:r>
           </w:p>
         </w:tc>
@@ -6220,7 +6222,7 @@
                 <w:color w:val="0F4C5C"/>
                 <w:sz w:val="17"/>
               </w:rPr>
-              <w:t xml:space="preserve">modules[0].items[2].evidence</w:t>
+              <w:t>modules[0].items[2].evidence</w:t>
             </w:r>
           </w:p>
         </w:tc>
@@ -6242,7 +6244,7 @@
                 <w:sz w:val="18"/>
                 <w:highlight w:val="yellow"/>
               </w:rPr>
-              <w:t xml:space="preserve">[在此填写：modules[0].items[2].evidence]</w:t>
+              <w:t>[在此填写：modules[0].items[2].evidence]</w:t>
             </w:r>
           </w:p>
         </w:tc>
@@ -6265,7 +6267,7 @@
                 <w:color w:val="64748B"/>
                 <w:sz w:val="16"/>
               </w:rPr>
-              <w:t xml:space="preserve">结果、数据或可核实证据</w:t>
+              <w:t>结果、数据或可核实证据</w:t>
             </w:r>
           </w:p>
         </w:tc>
@@ -6310,7 +6312,7 @@
                 <w:color w:val="334155"/>
                 <w:sz w:val="17"/>
               </w:rPr>
-              <w:t xml:space="preserve">模块一 条目 4</w:t>
+              <w:t>模块一 条目 4</w:t>
             </w:r>
           </w:p>
         </w:tc>
@@ -6334,7 +6336,7 @@
                 <w:color w:val="0F4C5C"/>
                 <w:sz w:val="17"/>
               </w:rPr>
-              <w:t xml:space="preserve">modules[0].items[3].date</w:t>
+              <w:t>modules[0].items[3].date</w:t>
             </w:r>
           </w:p>
         </w:tc>
@@ -6357,7 +6359,7 @@
                 <w:sz w:val="18"/>
                 <w:highlight w:val="yellow"/>
               </w:rPr>
-              <w:t xml:space="preserve">[在此填写：modules[0].items[3].date]</w:t>
+              <w:t>[在此填写：modules[0].items[3].date]</w:t>
             </w:r>
           </w:p>
         </w:tc>
@@ -6381,7 +6383,7 @@
                 <w:color w:val="64748B"/>
                 <w:sz w:val="16"/>
               </w:rPr>
-              <w:t xml:space="preserve">时间 / 阶段</w:t>
+              <w:t>时间 / 阶段</w:t>
             </w:r>
           </w:p>
         </w:tc>
@@ -6425,7 +6427,7 @@
                 <w:color w:val="334155"/>
                 <w:sz w:val="17"/>
               </w:rPr>
-              <w:t xml:space="preserve">模块一 条目 4</w:t>
+              <w:t>模块一 条目 4</w:t>
             </w:r>
           </w:p>
         </w:tc>
@@ -6448,7 +6450,7 @@
                 <w:color w:val="0F4C5C"/>
                 <w:sz w:val="17"/>
               </w:rPr>
-              <w:t xml:space="preserve">modules[0].items[3].title</w:t>
+              <w:t>modules[0].items[3].title</w:t>
             </w:r>
           </w:p>
         </w:tc>
@@ -6470,7 +6472,7 @@
                 <w:sz w:val="18"/>
                 <w:highlight w:val="yellow"/>
               </w:rPr>
-              <w:t xml:space="preserve">[在此填写：modules[0].items[3].title]</w:t>
+              <w:t>[在此填写：modules[0].items[3].title]</w:t>
             </w:r>
           </w:p>
         </w:tc>
@@ -6493,7 +6495,7 @@
                 <w:color w:val="64748B"/>
                 <w:sz w:val="16"/>
               </w:rPr>
-              <w:t xml:space="preserve">项目 / 角色名称</w:t>
+              <w:t>项目 / 角色名称</w:t>
             </w:r>
           </w:p>
         </w:tc>
@@ -6538,7 +6540,7 @@
                 <w:color w:val="334155"/>
                 <w:sz w:val="17"/>
               </w:rPr>
-              <w:t xml:space="preserve">模块一 条目 4</w:t>
+              <w:t>模块一 条目 4</w:t>
             </w:r>
           </w:p>
         </w:tc>
@@ -6562,7 +6564,7 @@
                 <w:color w:val="0F4C5C"/>
                 <w:sz w:val="17"/>
               </w:rPr>
-              <w:t xml:space="preserve">modules[0].items[3].summaryZh</w:t>
+              <w:t>modules[0].items[3].summaryZh</w:t>
             </w:r>
           </w:p>
         </w:tc>
@@ -6585,7 +6587,7 @@
                 <w:sz w:val="18"/>
                 <w:highlight w:val="yellow"/>
               </w:rPr>
-              <w:t xml:space="preserve">[在此填写：modules[0].items[3].summaryZh]</w:t>
+              <w:t>[在此填写：modules[0].items[3].summaryZh]</w:t>
             </w:r>
           </w:p>
         </w:tc>
@@ -6609,7 +6611,7 @@
                 <w:color w:val="64748B"/>
                 <w:sz w:val="16"/>
               </w:rPr>
-              <w:t xml:space="preserve">背景、职责与关键行动</w:t>
+              <w:t>背景、职责与关键行动</w:t>
             </w:r>
           </w:p>
         </w:tc>
@@ -6653,7 +6655,7 @@
                 <w:color w:val="334155"/>
                 <w:sz w:val="17"/>
               </w:rPr>
-              <w:t xml:space="preserve">模块一 条目 4</w:t>
+              <w:t>模块一 条目 4</w:t>
             </w:r>
           </w:p>
         </w:tc>
@@ -6676,7 +6678,7 @@
                 <w:color w:val="0F4C5C"/>
                 <w:sz w:val="17"/>
               </w:rPr>
-              <w:t xml:space="preserve">modules[0].items[3].summaryEn</w:t>
+              <w:t>modules[0].items[3].summaryEn</w:t>
             </w:r>
           </w:p>
         </w:tc>
@@ -6698,7 +6700,7 @@
                 <w:sz w:val="18"/>
                 <w:highlight w:val="yellow"/>
               </w:rPr>
-              <w:t xml:space="preserve">[在此填写：modules[0].items[3].summaryEn]</w:t>
+              <w:t>[在此填写：modules[0].items[3].summaryEn]</w:t>
             </w:r>
           </w:p>
         </w:tc>
@@ -6721,7 +6723,7 @@
                 <w:color w:val="64748B"/>
                 <w:sz w:val="16"/>
               </w:rPr>
-              <w:t xml:space="preserve">English summary; translate only supported facts</w:t>
+              <w:t>English summary; translate only supported facts</w:t>
             </w:r>
           </w:p>
         </w:tc>
@@ -6766,7 +6768,7 @@
                 <w:color w:val="334155"/>
                 <w:sz w:val="17"/>
               </w:rPr>
-              <w:t xml:space="preserve">模块一 条目 4</w:t>
+              <w:t>模块一 条目 4</w:t>
             </w:r>
           </w:p>
         </w:tc>
@@ -6790,7 +6792,7 @@
                 <w:color w:val="0F4C5C"/>
                 <w:sz w:val="17"/>
               </w:rPr>
-              <w:t xml:space="preserve">modules[0].items[3].evidence</w:t>
+              <w:t>modules[0].items[3].evidence</w:t>
             </w:r>
           </w:p>
         </w:tc>
@@ -6813,7 +6815,7 @@
                 <w:sz w:val="18"/>
                 <w:highlight w:val="yellow"/>
               </w:rPr>
-              <w:t xml:space="preserve">[在此填写：modules[0].items[3].evidence]</w:t>
+              <w:t>[在此填写：modules[0].items[3].evidence]</w:t>
             </w:r>
           </w:p>
         </w:tc>
@@ -6837,7 +6839,7 @@
                 <w:color w:val="64748B"/>
                 <w:sz w:val="16"/>
               </w:rPr>
-              <w:t xml:space="preserve">结果、数据或可核实证据</w:t>
+              <w:t>结果、数据或可核实证据</w:t>
             </w:r>
           </w:p>
         </w:tc>
@@ -10129,6 +10131,9 @@
         </w:rPr>
       </w:pPr>
       <w:r>
+        <w:rPr>
+          <w:rFonts w:hint="eastAsia" w:ascii="Noto Sans SC" w:hAnsi="Noto Sans SC" w:eastAsia="Noto Sans SC" w:cs="Noto Sans SC"/>
+        </w:rPr>
         <w:t>五 通用模块二 作品与专长</w:t>
       </w:r>
     </w:p>
@@ -10140,6 +10145,9 @@
         </w:rPr>
       </w:pPr>
       <w:r>
+        <w:rPr>
+          <w:rFonts w:hint="eastAsia" w:ascii="Noto Sans SC" w:hAnsi="Noto Sans SC" w:eastAsia="Noto Sans SC" w:cs="Noto Sans SC"/>
+        </w:rPr>
         <w:t>按个人 CV 特色改为个人作品集、核心技能、服务领域、奖项荣誉等。填两项最有辨识度的内容；不适用时可删除整组。</w:t>
       </w:r>
     </w:p>
@@ -10326,7 +10334,7 @@
                 <w:color w:val="334155"/>
                 <w:sz w:val="17"/>
               </w:rPr>
-              <w:t xml:space="preserve">通用模块二</w:t>
+              <w:t>通用模块二</w:t>
             </w:r>
           </w:p>
         </w:tc>
@@ -10349,7 +10357,7 @@
                 <w:color w:val="0F4C5C"/>
                 <w:sz w:val="17"/>
               </w:rPr>
-              <w:t xml:space="preserve">modules[1].type</w:t>
+              <w:t>modules[1].type</w:t>
             </w:r>
           </w:p>
         </w:tc>
@@ -10371,7 +10379,7 @@
                 <w:sz w:val="18"/>
                 <w:highlight w:val="yellow"/>
               </w:rPr>
-              <w:t xml:space="preserve">[在此填写：modules[1].type]</w:t>
+              <w:t>[在此填写：modules[1].type]</w:t>
             </w:r>
           </w:p>
         </w:tc>
@@ -10394,7 +10402,7 @@
                 <w:color w:val="64748B"/>
                 <w:sz w:val="16"/>
               </w:rPr>
-              <w:t xml:space="preserve">类型：portfolio / award / skill / research / service / other</w:t>
+              <w:t>类型：portfolio / award / skill / research / service / other</w:t>
             </w:r>
           </w:p>
         </w:tc>
@@ -10439,7 +10447,7 @@
                 <w:color w:val="334155"/>
                 <w:sz w:val="17"/>
               </w:rPr>
-              <w:t xml:space="preserve">通用模块二</w:t>
+              <w:t>通用模块二</w:t>
             </w:r>
           </w:p>
         </w:tc>
@@ -10463,7 +10471,7 @@
                 <w:color w:val="0F4C5C"/>
                 <w:sz w:val="17"/>
               </w:rPr>
-              <w:t xml:space="preserve">modules[1].heading</w:t>
+              <w:t>modules[1].heading</w:t>
             </w:r>
           </w:p>
         </w:tc>
@@ -10486,7 +10494,7 @@
                 <w:sz w:val="18"/>
                 <w:highlight w:val="yellow"/>
               </w:rPr>
-              <w:t xml:space="preserve">[在此填写：modules[1].heading]</w:t>
+              <w:t>[在此填写：modules[1].heading]</w:t>
             </w:r>
           </w:p>
         </w:tc>
@@ -10510,7 +10518,7 @@
                 <w:color w:val="64748B"/>
                 <w:sz w:val="16"/>
               </w:rPr>
-              <w:t xml:space="preserve">模块名称，例如个人作品集、奖项荣誉、核心专长</w:t>
+              <w:t>模块名称，例如个人作品集、奖项荣誉、核心专长</w:t>
             </w:r>
           </w:p>
         </w:tc>
@@ -10554,7 +10562,7 @@
                 <w:color w:val="334155"/>
                 <w:sz w:val="17"/>
               </w:rPr>
-              <w:t xml:space="preserve">模块二 条目 1</w:t>
+              <w:t>模块二 条目 1</w:t>
             </w:r>
           </w:p>
         </w:tc>
@@ -10577,7 +10585,7 @@
                 <w:color w:val="0F4C5C"/>
                 <w:sz w:val="17"/>
               </w:rPr>
-              <w:t xml:space="preserve">modules[1].items[0].title</w:t>
+              <w:t>modules[1].items[0].title</w:t>
             </w:r>
           </w:p>
         </w:tc>
@@ -10599,7 +10607,7 @@
                 <w:sz w:val="18"/>
                 <w:highlight w:val="yellow"/>
               </w:rPr>
-              <w:t xml:space="preserve">[在此填写：modules[1].items[0].title]</w:t>
+              <w:t>[在此填写：modules[1].items[0].title]</w:t>
             </w:r>
           </w:p>
         </w:tc>
@@ -10622,7 +10630,7 @@
                 <w:color w:val="64748B"/>
                 <w:sz w:val="16"/>
               </w:rPr>
-              <w:t xml:space="preserve">项目 / 作品 / 奖项名称</w:t>
+              <w:t>项目 / 作品 / 奖项名称</w:t>
             </w:r>
           </w:p>
         </w:tc>
@@ -10667,7 +10675,7 @@
                 <w:color w:val="334155"/>
                 <w:sz w:val="17"/>
               </w:rPr>
-              <w:t xml:space="preserve">模块二 条目 1</w:t>
+              <w:t>模块二 条目 1</w:t>
             </w:r>
           </w:p>
         </w:tc>
@@ -10691,7 +10699,7 @@
                 <w:color w:val="0F4C5C"/>
                 <w:sz w:val="17"/>
               </w:rPr>
-              <w:t xml:space="preserve">modules[1].items[0].detail</w:t>
+              <w:t>modules[1].items[0].detail</w:t>
             </w:r>
           </w:p>
         </w:tc>
@@ -10714,7 +10722,7 @@
                 <w:sz w:val="18"/>
                 <w:highlight w:val="yellow"/>
               </w:rPr>
-              <w:t xml:space="preserve">[在此填写：modules[1].items[0].detail]</w:t>
+              <w:t>[在此填写：modules[1].items[0].detail]</w:t>
             </w:r>
           </w:p>
         </w:tc>
@@ -10738,7 +10746,7 @@
                 <w:color w:val="64748B"/>
                 <w:sz w:val="16"/>
               </w:rPr>
-              <w:t xml:space="preserve">个人贡献、内容说明或获奖依据</w:t>
+              <w:t>个人贡献、内容说明或获奖依据</w:t>
             </w:r>
           </w:p>
         </w:tc>
@@ -10782,7 +10790,7 @@
                 <w:color w:val="334155"/>
                 <w:sz w:val="17"/>
               </w:rPr>
-              <w:t xml:space="preserve">模块二 条目 2</w:t>
+              <w:t>模块二 条目 2</w:t>
             </w:r>
           </w:p>
         </w:tc>
@@ -10805,7 +10813,7 @@
                 <w:color w:val="0F4C5C"/>
                 <w:sz w:val="17"/>
               </w:rPr>
-              <w:t xml:space="preserve">modules[1].items[1].title</w:t>
+              <w:t>modules[1].items[1].title</w:t>
             </w:r>
           </w:p>
         </w:tc>
@@ -10827,7 +10835,7 @@
                 <w:sz w:val="18"/>
                 <w:highlight w:val="yellow"/>
               </w:rPr>
-              <w:t xml:space="preserve">[在此填写：modules[1].items[1].title]</w:t>
+              <w:t>[在此填写：modules[1].items[1].title]</w:t>
             </w:r>
           </w:p>
         </w:tc>
@@ -10850,7 +10858,7 @@
                 <w:color w:val="64748B"/>
                 <w:sz w:val="16"/>
               </w:rPr>
-              <w:t xml:space="preserve">项目 / 作品 / 奖项名称</w:t>
+              <w:t>项目 / 作品 / 奖项名称</w:t>
             </w:r>
           </w:p>
         </w:tc>
@@ -10895,7 +10903,7 @@
                 <w:color w:val="334155"/>
                 <w:sz w:val="17"/>
               </w:rPr>
-              <w:t xml:space="preserve">模块二 条目 2</w:t>
+              <w:t>模块二 条目 2</w:t>
             </w:r>
           </w:p>
         </w:tc>
@@ -10919,7 +10927,7 @@
                 <w:color w:val="0F4C5C"/>
                 <w:sz w:val="17"/>
               </w:rPr>
-              <w:t xml:space="preserve">modules[1].items[1].detail</w:t>
+              <w:t>modules[1].items[1].detail</w:t>
             </w:r>
           </w:p>
         </w:tc>
@@ -10942,7 +10950,7 @@
                 <w:sz w:val="18"/>
                 <w:highlight w:val="yellow"/>
               </w:rPr>
-              <w:t xml:space="preserve">[在此填写：modules[1].items[1].detail]</w:t>
+              <w:t>[在此填写：modules[1].items[1].detail]</w:t>
             </w:r>
           </w:p>
         </w:tc>
@@ -10966,7 +10974,7 @@
                 <w:color w:val="64748B"/>
                 <w:sz w:val="16"/>
               </w:rPr>
-              <w:t xml:space="preserve">个人贡献、内容说明或获奖依据</w:t>
+              <w:t>个人贡献、内容说明或获奖依据</w:t>
             </w:r>
           </w:p>
         </w:tc>
@@ -10988,6 +10996,9 @@
         </w:rPr>
       </w:pPr>
       <w:r>
+        <w:rPr>
+          <w:rFonts w:hint="eastAsia" w:ascii="Noto Sans SC" w:hAnsi="Noto Sans SC" w:eastAsia="Noto Sans SC" w:cs="Noto Sans SC"/>
+        </w:rPr>
         <w:t>六 通用模块三 精选成果</w:t>
       </w:r>
     </w:p>
@@ -10999,6 +11010,9 @@
         </w:rPr>
       </w:pPr>
       <w:r>
+        <w:rPr>
+          <w:rFonts w:hint="eastAsia" w:ascii="Noto Sans SC" w:hAnsi="Noto Sans SC" w:eastAsia="Noto Sans SC" w:cs="Noto Sans SC"/>
+        </w:rPr>
         <w:t>选择最能证明个人能力的一项成果，可为项目、作品、奖项、客户成果、论文或其他经历。没有独立成果模块时可并入上方模块。</w:t>
       </w:r>
     </w:p>
@@ -11185,7 +11199,7 @@
                 <w:color w:val="334155"/>
                 <w:sz w:val="17"/>
               </w:rPr>
-              <w:t xml:space="preserve">通用模块三</w:t>
+              <w:t>通用模块三</w:t>
             </w:r>
           </w:p>
         </w:tc>
@@ -11208,7 +11222,7 @@
                 <w:color w:val="0F4C5C"/>
                 <w:sz w:val="17"/>
               </w:rPr>
-              <w:t xml:space="preserve">modules[2].type</w:t>
+              <w:t>modules[2].type</w:t>
             </w:r>
           </w:p>
         </w:tc>
@@ -11230,7 +11244,7 @@
                 <w:sz w:val="18"/>
                 <w:highlight w:val="yellow"/>
               </w:rPr>
-              <w:t xml:space="preserve">[在此填写：modules[2].type]</w:t>
+              <w:t>[在此填写：modules[2].type]</w:t>
             </w:r>
           </w:p>
         </w:tc>
@@ -11253,7 +11267,7 @@
                 <w:color w:val="64748B"/>
                 <w:sz w:val="16"/>
               </w:rPr>
-              <w:t xml:space="preserve">类型：project / portfolio / award / research / publication / other</w:t>
+              <w:t>类型：project / portfolio / award / research / publication / other</w:t>
             </w:r>
           </w:p>
         </w:tc>
@@ -11298,7 +11312,7 @@
                 <w:color w:val="334155"/>
                 <w:sz w:val="17"/>
               </w:rPr>
-              <w:t xml:space="preserve">精选成果</w:t>
+              <w:t>精选成果</w:t>
             </w:r>
           </w:p>
         </w:tc>
@@ -11322,7 +11336,7 @@
                 <w:color w:val="0F4C5C"/>
                 <w:sz w:val="17"/>
               </w:rPr>
-              <w:t xml:space="preserve">modules[2].items[0].title</w:t>
+              <w:t>modules[2].items[0].title</w:t>
             </w:r>
           </w:p>
         </w:tc>
@@ -11345,7 +11359,7 @@
                 <w:sz w:val="18"/>
                 <w:highlight w:val="yellow"/>
               </w:rPr>
-              <w:t xml:space="preserve">[在此填写：modules[2].items[0].title]</w:t>
+              <w:t>[在此填写：modules[2].items[0].title]</w:t>
             </w:r>
           </w:p>
         </w:tc>
@@ -11369,7 +11383,7 @@
                 <w:color w:val="64748B"/>
                 <w:sz w:val="16"/>
               </w:rPr>
-              <w:t xml:space="preserve">成果名称</w:t>
+              <w:t>成果名称</w:t>
             </w:r>
           </w:p>
         </w:tc>
@@ -11413,7 +11427,7 @@
                 <w:color w:val="334155"/>
                 <w:sz w:val="17"/>
               </w:rPr>
-              <w:t xml:space="preserve">精选成果</w:t>
+              <w:t>精选成果</w:t>
             </w:r>
           </w:p>
         </w:tc>
@@ -11436,7 +11450,7 @@
                 <w:color w:val="0F4C5C"/>
                 <w:sz w:val="17"/>
               </w:rPr>
-              <w:t xml:space="preserve">modules[2].items[0].date</w:t>
+              <w:t>modules[2].items[0].date</w:t>
             </w:r>
           </w:p>
         </w:tc>
@@ -11458,7 +11472,7 @@
                 <w:sz w:val="18"/>
                 <w:highlight w:val="yellow"/>
               </w:rPr>
-              <w:t xml:space="preserve">[在此填写：modules[2].items[0].date]</w:t>
+              <w:t>[在此填写：modules[2].items[0].date]</w:t>
             </w:r>
           </w:p>
         </w:tc>
@@ -11481,7 +11495,7 @@
                 <w:color w:val="64748B"/>
                 <w:sz w:val="16"/>
               </w:rPr>
-              <w:t xml:space="preserve">年份 / 时间</w:t>
+              <w:t>年份 / 时间</w:t>
             </w:r>
           </w:p>
         </w:tc>
@@ -11526,7 +11540,7 @@
                 <w:color w:val="334155"/>
                 <w:sz w:val="17"/>
               </w:rPr>
-              <w:t xml:space="preserve">精选成果</w:t>
+              <w:t>精选成果</w:t>
             </w:r>
           </w:p>
         </w:tc>
@@ -11550,7 +11564,7 @@
                 <w:color w:val="0F4C5C"/>
                 <w:sz w:val="17"/>
               </w:rPr>
-              <w:t xml:space="preserve">modules[2].items[0].detail</w:t>
+              <w:t>modules[2].items[0].detail</w:t>
             </w:r>
           </w:p>
         </w:tc>
@@ -11573,7 +11587,7 @@
                 <w:sz w:val="18"/>
                 <w:highlight w:val="yellow"/>
               </w:rPr>
-              <w:t xml:space="preserve">[在此填写：modules[2].items[0].detail]</w:t>
+              <w:t>[在此填写：modules[2].items[0].detail]</w:t>
             </w:r>
           </w:p>
         </w:tc>
@@ -11597,7 +11611,7 @@
                 <w:color w:val="64748B"/>
                 <w:sz w:val="16"/>
               </w:rPr>
-              <w:t xml:space="preserve">贡献、影响、出处或链接说明</w:t>
+              <w:t>贡献、影响、出处或链接说明</w:t>
             </w:r>
           </w:p>
         </w:tc>
@@ -11631,8 +11645,6 @@
         </w:rPr>
         <w:t xml:space="preserve">  </w:t>
       </w:r>
-      <w:bookmarkStart w:id="0" w:name="_GoBack"/>
-      <w:bookmarkEnd w:id="0"/>
       <w:r>
         <w:rPr>
           <w:rFonts w:hint="eastAsia" w:ascii="Noto Sans SC" w:hAnsi="Noto Sans SC" w:eastAsia="Noto Sans SC" w:cs="Noto Sans SC"/>
@@ -12066,7 +12078,7 @@
                 <w:color w:val="334155"/>
                 <w:sz w:val="17"/>
               </w:rPr>
-              <w:t xml:space="preserve">Contact</w:t>
+              <w:t>Contact</w:t>
             </w:r>
           </w:p>
         </w:tc>
@@ -12090,7 +12102,7 @@
                 <w:color w:val="0F4C5C"/>
                 <w:sz w:val="17"/>
               </w:rPr>
-              <w:t xml:space="preserve">contact.phone</w:t>
+              <w:t>contact.phone</w:t>
             </w:r>
           </w:p>
         </w:tc>
@@ -12113,7 +12125,7 @@
                 <w:sz w:val="18"/>
                 <w:highlight w:val="yellow"/>
               </w:rPr>
-              <w:t xml:space="preserve">[在此填写：contact.phone]</w:t>
+              <w:t>[在此填写：contact.phone]</w:t>
             </w:r>
           </w:p>
         </w:tc>
@@ -12137,7 +12149,7 @@
                 <w:color w:val="64748B"/>
                 <w:sz w:val="16"/>
               </w:rPr>
-              <w:t xml:space="preserve">公开手机号；仅本人同意公开时填写</w:t>
+              <w:t>公开手机号；仅本人同意公开时填写</w:t>
             </w:r>
           </w:p>
         </w:tc>
@@ -12412,8 +12424,8 @@
     <w:lsdException w:uiPriority="99" w:name="Normal Indent"/>
     <w:lsdException w:uiPriority="99" w:name="footnote text"/>
     <w:lsdException w:uiPriority="99" w:name="annotation text"/>
-    <w:lsdException w:uiPriority="99" w:semiHidden="0" w:name="header"/>
-    <w:lsdException w:uiPriority="99" w:semiHidden="0" w:name="footer"/>
+    <w:lsdException w:qFormat="1" w:uiPriority="99" w:semiHidden="0" w:name="header"/>
+    <w:lsdException w:qFormat="1" w:uiPriority="99" w:semiHidden="0" w:name="footer"/>
     <w:lsdException w:uiPriority="99" w:name="index heading"/>
     <w:lsdException w:qFormat="1" w:uiPriority="35" w:name="caption"/>
     <w:lsdException w:uiPriority="99" w:name="table of figures"/>
@@ -12428,19 +12440,19 @@
     <w:lsdException w:uiPriority="99" w:name="table of authorities"/>
     <w:lsdException w:uiPriority="99" w:semiHidden="0" w:name="macro"/>
     <w:lsdException w:uiPriority="99" w:name="toa heading"/>
-    <w:lsdException w:uiPriority="99" w:semiHidden="0" w:name="List"/>
+    <w:lsdException w:qFormat="1" w:uiPriority="99" w:semiHidden="0" w:name="List"/>
     <w:lsdException w:uiPriority="99" w:semiHidden="0" w:name="List Bullet"/>
     <w:lsdException w:uiPriority="99" w:semiHidden="0" w:name="List Number"/>
-    <w:lsdException w:uiPriority="99" w:semiHidden="0" w:name="List 2"/>
+    <w:lsdException w:qFormat="1" w:uiPriority="99" w:semiHidden="0" w:name="List 2"/>
     <w:lsdException w:uiPriority="99" w:semiHidden="0" w:name="List 3"/>
     <w:lsdException w:uiPriority="99" w:name="List 4"/>
     <w:lsdException w:uiPriority="99" w:name="List 5"/>
-    <w:lsdException w:uiPriority="99" w:semiHidden="0" w:name="List Bullet 2"/>
+    <w:lsdException w:qFormat="1" w:uiPriority="99" w:semiHidden="0" w:name="List Bullet 2"/>
     <w:lsdException w:uiPriority="99" w:semiHidden="0" w:name="List Bullet 3"/>
     <w:lsdException w:uiPriority="99" w:name="List Bullet 4"/>
     <w:lsdException w:uiPriority="99" w:name="List Bullet 5"/>
     <w:lsdException w:uiPriority="99" w:semiHidden="0" w:name="List Number 2"/>
-    <w:lsdException w:uiPriority="99" w:semiHidden="0" w:name="List Number 3"/>
+    <w:lsdException w:qFormat="1" w:uiPriority="99" w:semiHidden="0" w:name="List Number 3"/>
     <w:lsdException w:uiPriority="99" w:name="List Number 4"/>
     <w:lsdException w:uiPriority="99" w:name="List Number 5"/>
     <w:lsdException w:qFormat="1" w:unhideWhenUsed="0" w:uiPriority="10" w:semiHidden="0" w:name="Title"/>
@@ -12449,8 +12461,8 @@
     <w:lsdException w:uiPriority="1" w:name="Default Paragraph Font"/>
     <w:lsdException w:uiPriority="99" w:semiHidden="0" w:name="Body Text"/>
     <w:lsdException w:uiPriority="99" w:name="Body Text Indent"/>
-    <w:lsdException w:uiPriority="99" w:semiHidden="0" w:name="List Continue"/>
-    <w:lsdException w:uiPriority="99" w:semiHidden="0" w:name="List Continue 2"/>
+    <w:lsdException w:qFormat="1" w:uiPriority="99" w:semiHidden="0" w:name="List Continue"/>
+    <w:lsdException w:qFormat="1" w:uiPriority="99" w:semiHidden="0" w:name="List Continue 2"/>
     <w:lsdException w:uiPriority="99" w:semiHidden="0" w:name="List Continue 3"/>
     <w:lsdException w:uiPriority="99" w:name="List Continue 4"/>
     <w:lsdException w:uiPriority="99" w:name="List Continue 5"/>
@@ -12529,62 +12541,62 @@
     <w:lsdException w:uiPriority="99" w:name="Table Web 2"/>
     <w:lsdException w:uiPriority="99" w:name="Table Web 3"/>
     <w:lsdException w:uiPriority="99" w:name="Balloon Text"/>
-    <w:lsdException w:unhideWhenUsed="0" w:uiPriority="59" w:semiHidden="0" w:name="Table Grid"/>
+    <w:lsdException w:qFormat="1" w:unhideWhenUsed="0" w:uiPriority="59" w:semiHidden="0" w:name="Table Grid"/>
     <w:lsdException w:uiPriority="99" w:name="Table Theme"/>
     <w:lsdException w:qFormat="1" w:unhideWhenUsed="0" w:uiPriority="1" w:semiHidden="0" w:name="No Spacing"/>
     <w:lsdException w:unhideWhenUsed="0" w:uiPriority="60" w:semiHidden="0" w:name="Light Shading"/>
-    <w:lsdException w:unhideWhenUsed="0" w:uiPriority="61" w:semiHidden="0" w:name="Light List"/>
-    <w:lsdException w:unhideWhenUsed="0" w:uiPriority="62" w:semiHidden="0" w:name="Light Grid"/>
-    <w:lsdException w:unhideWhenUsed="0" w:uiPriority="63" w:semiHidden="0" w:name="Medium Shading 1"/>
+    <w:lsdException w:qFormat="1" w:unhideWhenUsed="0" w:uiPriority="61" w:semiHidden="0" w:name="Light List"/>
+    <w:lsdException w:qFormat="1" w:unhideWhenUsed="0" w:uiPriority="62" w:semiHidden="0" w:name="Light Grid"/>
+    <w:lsdException w:qFormat="1" w:unhideWhenUsed="0" w:uiPriority="63" w:semiHidden="0" w:name="Medium Shading 1"/>
     <w:lsdException w:unhideWhenUsed="0" w:uiPriority="64" w:semiHidden="0" w:name="Medium Shading 2"/>
-    <w:lsdException w:unhideWhenUsed="0" w:uiPriority="65" w:semiHidden="0" w:name="Medium List 1"/>
-    <w:lsdException w:unhideWhenUsed="0" w:uiPriority="66" w:semiHidden="0" w:name="Medium List 2"/>
-    <w:lsdException w:unhideWhenUsed="0" w:uiPriority="67" w:semiHidden="0" w:name="Medium Grid 1"/>
-    <w:lsdException w:unhideWhenUsed="0" w:uiPriority="68" w:semiHidden="0" w:name="Medium Grid 2"/>
+    <w:lsdException w:qFormat="1" w:unhideWhenUsed="0" w:uiPriority="65" w:semiHidden="0" w:name="Medium List 1"/>
+    <w:lsdException w:qFormat="1" w:unhideWhenUsed="0" w:uiPriority="66" w:semiHidden="0" w:name="Medium List 2"/>
+    <w:lsdException w:qFormat="1" w:unhideWhenUsed="0" w:uiPriority="67" w:semiHidden="0" w:name="Medium Grid 1"/>
+    <w:lsdException w:qFormat="1" w:unhideWhenUsed="0" w:uiPriority="68" w:semiHidden="0" w:name="Medium Grid 2"/>
     <w:lsdException w:unhideWhenUsed="0" w:uiPriority="69" w:semiHidden="0" w:name="Medium Grid 3"/>
     <w:lsdException w:unhideWhenUsed="0" w:uiPriority="70" w:semiHidden="0" w:name="Dark List"/>
     <w:lsdException w:unhideWhenUsed="0" w:uiPriority="71" w:semiHidden="0" w:name="Colorful Shading"/>
     <w:lsdException w:unhideWhenUsed="0" w:uiPriority="72" w:semiHidden="0" w:name="Colorful List"/>
     <w:lsdException w:unhideWhenUsed="0" w:uiPriority="73" w:semiHidden="0" w:name="Colorful Grid"/>
-    <w:lsdException w:unhideWhenUsed="0" w:uiPriority="60" w:semiHidden="0" w:name="Light Shading Accent 1"/>
-    <w:lsdException w:unhideWhenUsed="0" w:uiPriority="61" w:semiHidden="0" w:name="Light List Accent 1"/>
-    <w:lsdException w:unhideWhenUsed="0" w:uiPriority="62" w:semiHidden="0" w:name="Light Grid Accent 1"/>
+    <w:lsdException w:qFormat="1" w:unhideWhenUsed="0" w:uiPriority="60" w:semiHidden="0" w:name="Light Shading Accent 1"/>
+    <w:lsdException w:qFormat="1" w:unhideWhenUsed="0" w:uiPriority="61" w:semiHidden="0" w:name="Light List Accent 1"/>
+    <w:lsdException w:qFormat="1" w:unhideWhenUsed="0" w:uiPriority="62" w:semiHidden="0" w:name="Light Grid Accent 1"/>
     <w:lsdException w:unhideWhenUsed="0" w:uiPriority="63" w:semiHidden="0" w:name="Medium Shading 1 Accent 1"/>
-    <w:lsdException w:unhideWhenUsed="0" w:uiPriority="64" w:semiHidden="0" w:name="Medium Shading 2 Accent 1"/>
+    <w:lsdException w:qFormat="1" w:unhideWhenUsed="0" w:uiPriority="64" w:semiHidden="0" w:name="Medium Shading 2 Accent 1"/>
     <w:lsdException w:unhideWhenUsed="0" w:uiPriority="65" w:semiHidden="0" w:name="Medium List 1 Accent 1"/>
     <w:lsdException w:qFormat="1" w:unhideWhenUsed="0" w:uiPriority="34" w:semiHidden="0" w:name="List Paragraph"/>
     <w:lsdException w:qFormat="1" w:unhideWhenUsed="0" w:uiPriority="29" w:semiHidden="0" w:name="Quote"/>
     <w:lsdException w:qFormat="1" w:unhideWhenUsed="0" w:uiPriority="30" w:semiHidden="0" w:name="Intense Quote"/>
     <w:lsdException w:unhideWhenUsed="0" w:uiPriority="66" w:semiHidden="0" w:name="Medium List 2 Accent 1"/>
-    <w:lsdException w:unhideWhenUsed="0" w:uiPriority="67" w:semiHidden="0" w:name="Medium Grid 1 Accent 1"/>
+    <w:lsdException w:qFormat="1" w:unhideWhenUsed="0" w:uiPriority="67" w:semiHidden="0" w:name="Medium Grid 1 Accent 1"/>
     <w:lsdException w:unhideWhenUsed="0" w:uiPriority="68" w:semiHidden="0" w:name="Medium Grid 2 Accent 1"/>
     <w:lsdException w:unhideWhenUsed="0" w:uiPriority="69" w:semiHidden="0" w:name="Medium Grid 3 Accent 1"/>
     <w:lsdException w:unhideWhenUsed="0" w:uiPriority="70" w:semiHidden="0" w:name="Dark List Accent 1"/>
     <w:lsdException w:unhideWhenUsed="0" w:uiPriority="71" w:semiHidden="0" w:name="Colorful Shading Accent 1"/>
     <w:lsdException w:unhideWhenUsed="0" w:uiPriority="72" w:semiHidden="0" w:name="Colorful List Accent 1"/>
     <w:lsdException w:unhideWhenUsed="0" w:uiPriority="73" w:semiHidden="0" w:name="Colorful Grid Accent 1"/>
-    <w:lsdException w:unhideWhenUsed="0" w:uiPriority="60" w:semiHidden="0" w:name="Light Shading Accent 2"/>
-    <w:lsdException w:unhideWhenUsed="0" w:uiPriority="61" w:semiHidden="0" w:name="Light List Accent 2"/>
-    <w:lsdException w:unhideWhenUsed="0" w:uiPriority="62" w:semiHidden="0" w:name="Light Grid Accent 2"/>
+    <w:lsdException w:qFormat="1" w:unhideWhenUsed="0" w:uiPriority="60" w:semiHidden="0" w:name="Light Shading Accent 2"/>
+    <w:lsdException w:qFormat="1" w:unhideWhenUsed="0" w:uiPriority="61" w:semiHidden="0" w:name="Light List Accent 2"/>
+    <w:lsdException w:qFormat="1" w:unhideWhenUsed="0" w:uiPriority="62" w:semiHidden="0" w:name="Light Grid Accent 2"/>
     <w:lsdException w:unhideWhenUsed="0" w:uiPriority="63" w:semiHidden="0" w:name="Medium Shading 1 Accent 2"/>
-    <w:lsdException w:unhideWhenUsed="0" w:uiPriority="64" w:semiHidden="0" w:name="Medium Shading 2 Accent 2"/>
-    <w:lsdException w:unhideWhenUsed="0" w:uiPriority="65" w:semiHidden="0" w:name="Medium List 1 Accent 2"/>
+    <w:lsdException w:qFormat="1" w:unhideWhenUsed="0" w:uiPriority="64" w:semiHidden="0" w:name="Medium Shading 2 Accent 2"/>
+    <w:lsdException w:qFormat="1" w:unhideWhenUsed="0" w:uiPriority="65" w:semiHidden="0" w:name="Medium List 1 Accent 2"/>
     <w:lsdException w:unhideWhenUsed="0" w:uiPriority="66" w:semiHidden="0" w:name="Medium List 2 Accent 2"/>
     <w:lsdException w:unhideWhenUsed="0" w:uiPriority="67" w:semiHidden="0" w:name="Medium Grid 1 Accent 2"/>
-    <w:lsdException w:unhideWhenUsed="0" w:uiPriority="68" w:semiHidden="0" w:name="Medium Grid 2 Accent 2"/>
+    <w:lsdException w:qFormat="1" w:unhideWhenUsed="0" w:uiPriority="68" w:semiHidden="0" w:name="Medium Grid 2 Accent 2"/>
     <w:lsdException w:unhideWhenUsed="0" w:uiPriority="69" w:semiHidden="0" w:name="Medium Grid 3 Accent 2"/>
     <w:lsdException w:unhideWhenUsed="0" w:uiPriority="70" w:semiHidden="0" w:name="Dark List Accent 2"/>
     <w:lsdException w:unhideWhenUsed="0" w:uiPriority="71" w:semiHidden="0" w:name="Colorful Shading Accent 2"/>
     <w:lsdException w:unhideWhenUsed="0" w:uiPriority="72" w:semiHidden="0" w:name="Colorful List Accent 2"/>
     <w:lsdException w:unhideWhenUsed="0" w:uiPriority="73" w:semiHidden="0" w:name="Colorful Grid Accent 2"/>
-    <w:lsdException w:unhideWhenUsed="0" w:uiPriority="60" w:semiHidden="0" w:name="Light Shading Accent 3"/>
+    <w:lsdException w:qFormat="1" w:unhideWhenUsed="0" w:uiPriority="60" w:semiHidden="0" w:name="Light Shading Accent 3"/>
     <w:lsdException w:unhideWhenUsed="0" w:uiPriority="61" w:semiHidden="0" w:name="Light List Accent 3"/>
-    <w:lsdException w:unhideWhenUsed="0" w:uiPriority="62" w:semiHidden="0" w:name="Light Grid Accent 3"/>
+    <w:lsdException w:qFormat="1" w:unhideWhenUsed="0" w:uiPriority="62" w:semiHidden="0" w:name="Light Grid Accent 3"/>
     <w:lsdException w:unhideWhenUsed="0" w:uiPriority="63" w:semiHidden="0" w:name="Medium Shading 1 Accent 3"/>
-    <w:lsdException w:unhideWhenUsed="0" w:uiPriority="64" w:semiHidden="0" w:name="Medium Shading 2 Accent 3"/>
+    <w:lsdException w:qFormat="1" w:unhideWhenUsed="0" w:uiPriority="64" w:semiHidden="0" w:name="Medium Shading 2 Accent 3"/>
     <w:lsdException w:unhideWhenUsed="0" w:uiPriority="65" w:semiHidden="0" w:name="Medium List 1 Accent 3"/>
     <w:lsdException w:unhideWhenUsed="0" w:uiPriority="66" w:semiHidden="0" w:name="Medium List 2 Accent 3"/>
-    <w:lsdException w:unhideWhenUsed="0" w:uiPriority="67" w:semiHidden="0" w:name="Medium Grid 1 Accent 3"/>
+    <w:lsdException w:qFormat="1" w:unhideWhenUsed="0" w:uiPriority="67" w:semiHidden="0" w:name="Medium Grid 1 Accent 3"/>
     <w:lsdException w:unhideWhenUsed="0" w:uiPriority="68" w:semiHidden="0" w:name="Medium Grid 2 Accent 3"/>
     <w:lsdException w:unhideWhenUsed="0" w:uiPriority="69" w:semiHidden="0" w:name="Medium Grid 3 Accent 3"/>
     <w:lsdException w:unhideWhenUsed="0" w:uiPriority="70" w:semiHidden="0" w:name="Dark List Accent 3"/>
@@ -12595,39 +12607,39 @@
     <w:lsdException w:unhideWhenUsed="0" w:uiPriority="61" w:semiHidden="0" w:name="Light List Accent 4"/>
     <w:lsdException w:unhideWhenUsed="0" w:uiPriority="62" w:semiHidden="0" w:name="Light Grid Accent 4"/>
     <w:lsdException w:unhideWhenUsed="0" w:uiPriority="63" w:semiHidden="0" w:name="Medium Shading 1 Accent 4"/>
-    <w:lsdException w:unhideWhenUsed="0" w:uiPriority="64" w:semiHidden="0" w:name="Medium Shading 2 Accent 4"/>
+    <w:lsdException w:qFormat="1" w:unhideWhenUsed="0" w:uiPriority="64" w:semiHidden="0" w:name="Medium Shading 2 Accent 4"/>
     <w:lsdException w:unhideWhenUsed="0" w:uiPriority="65" w:semiHidden="0" w:name="Medium List 1 Accent 4"/>
     <w:lsdException w:unhideWhenUsed="0" w:uiPriority="66" w:semiHidden="0" w:name="Medium List 2 Accent 4"/>
     <w:lsdException w:unhideWhenUsed="0" w:uiPriority="67" w:semiHidden="0" w:name="Medium Grid 1 Accent 4"/>
-    <w:lsdException w:unhideWhenUsed="0" w:uiPriority="68" w:semiHidden="0" w:name="Medium Grid 2 Accent 4"/>
+    <w:lsdException w:qFormat="1" w:unhideWhenUsed="0" w:uiPriority="68" w:semiHidden="0" w:name="Medium Grid 2 Accent 4"/>
     <w:lsdException w:unhideWhenUsed="0" w:uiPriority="69" w:semiHidden="0" w:name="Medium Grid 3 Accent 4"/>
     <w:lsdException w:unhideWhenUsed="0" w:uiPriority="70" w:semiHidden="0" w:name="Dark List Accent 4"/>
     <w:lsdException w:unhideWhenUsed="0" w:uiPriority="71" w:semiHidden="0" w:name="Colorful Shading Accent 4"/>
     <w:lsdException w:unhideWhenUsed="0" w:uiPriority="72" w:semiHidden="0" w:name="Colorful List Accent 4"/>
     <w:lsdException w:unhideWhenUsed="0" w:uiPriority="73" w:semiHidden="0" w:name="Colorful Grid Accent 4"/>
-    <w:lsdException w:unhideWhenUsed="0" w:uiPriority="60" w:semiHidden="0" w:name="Light Shading Accent 5"/>
+    <w:lsdException w:qFormat="1" w:unhideWhenUsed="0" w:uiPriority="60" w:semiHidden="0" w:name="Light Shading Accent 5"/>
     <w:lsdException w:unhideWhenUsed="0" w:uiPriority="61" w:semiHidden="0" w:name="Light List Accent 5"/>
-    <w:lsdException w:unhideWhenUsed="0" w:uiPriority="62" w:semiHidden="0" w:name="Light Grid Accent 5"/>
+    <w:lsdException w:qFormat="1" w:unhideWhenUsed="0" w:uiPriority="62" w:semiHidden="0" w:name="Light Grid Accent 5"/>
     <w:lsdException w:unhideWhenUsed="0" w:uiPriority="63" w:semiHidden="0" w:name="Medium Shading 1 Accent 5"/>
-    <w:lsdException w:unhideWhenUsed="0" w:uiPriority="64" w:semiHidden="0" w:name="Medium Shading 2 Accent 5"/>
+    <w:lsdException w:qFormat="1" w:unhideWhenUsed="0" w:uiPriority="64" w:semiHidden="0" w:name="Medium Shading 2 Accent 5"/>
     <w:lsdException w:unhideWhenUsed="0" w:uiPriority="65" w:semiHidden="0" w:name="Medium List 1 Accent 5"/>
     <w:lsdException w:unhideWhenUsed="0" w:uiPriority="66" w:semiHidden="0" w:name="Medium List 2 Accent 5"/>
     <w:lsdException w:unhideWhenUsed="0" w:uiPriority="67" w:semiHidden="0" w:name="Medium Grid 1 Accent 5"/>
-    <w:lsdException w:unhideWhenUsed="0" w:uiPriority="68" w:semiHidden="0" w:name="Medium Grid 2 Accent 5"/>
+    <w:lsdException w:qFormat="1" w:unhideWhenUsed="0" w:uiPriority="68" w:semiHidden="0" w:name="Medium Grid 2 Accent 5"/>
     <w:lsdException w:unhideWhenUsed="0" w:uiPriority="69" w:semiHidden="0" w:name="Medium Grid 3 Accent 5"/>
     <w:lsdException w:unhideWhenUsed="0" w:uiPriority="70" w:semiHidden="0" w:name="Dark List Accent 5"/>
     <w:lsdException w:unhideWhenUsed="0" w:uiPriority="71" w:semiHidden="0" w:name="Colorful Shading Accent 5"/>
     <w:lsdException w:unhideWhenUsed="0" w:uiPriority="72" w:semiHidden="0" w:name="Colorful List Accent 5"/>
     <w:lsdException w:unhideWhenUsed="0" w:uiPriority="73" w:semiHidden="0" w:name="Colorful Grid Accent 5"/>
-    <w:lsdException w:unhideWhenUsed="0" w:uiPriority="60" w:semiHidden="0" w:name="Light Shading Accent 6"/>
+    <w:lsdException w:qFormat="1" w:unhideWhenUsed="0" w:uiPriority="60" w:semiHidden="0" w:name="Light Shading Accent 6"/>
     <w:lsdException w:unhideWhenUsed="0" w:uiPriority="61" w:semiHidden="0" w:name="Light List Accent 6"/>
-    <w:lsdException w:unhideWhenUsed="0" w:uiPriority="62" w:semiHidden="0" w:name="Light Grid Accent 6"/>
-    <w:lsdException w:unhideWhenUsed="0" w:uiPriority="63" w:semiHidden="0" w:name="Medium Shading 1 Accent 6"/>
+    <w:lsdException w:qFormat="1" w:unhideWhenUsed="0" w:uiPriority="62" w:semiHidden="0" w:name="Light Grid Accent 6"/>
+    <w:lsdException w:qFormat="1" w:unhideWhenUsed="0" w:uiPriority="63" w:semiHidden="0" w:name="Medium Shading 1 Accent 6"/>
     <w:lsdException w:unhideWhenUsed="0" w:uiPriority="64" w:semiHidden="0" w:name="Medium Shading 2 Accent 6"/>
     <w:lsdException w:unhideWhenUsed="0" w:uiPriority="65" w:semiHidden="0" w:name="Medium List 1 Accent 6"/>
     <w:lsdException w:unhideWhenUsed="0" w:uiPriority="66" w:semiHidden="0" w:name="Medium List 2 Accent 6"/>
-    <w:lsdException w:unhideWhenUsed="0" w:uiPriority="67" w:semiHidden="0" w:name="Medium Grid 1 Accent 6"/>
-    <w:lsdException w:unhideWhenUsed="0" w:uiPriority="68" w:semiHidden="0" w:name="Medium Grid 2 Accent 6"/>
+    <w:lsdException w:qFormat="1" w:unhideWhenUsed="0" w:uiPriority="67" w:semiHidden="0" w:name="Medium Grid 1 Accent 6"/>
+    <w:lsdException w:qFormat="1" w:unhideWhenUsed="0" w:uiPriority="68" w:semiHidden="0" w:name="Medium Grid 2 Accent 6"/>
     <w:lsdException w:unhideWhenUsed="0" w:uiPriority="69" w:semiHidden="0" w:name="Medium Grid 3 Accent 6"/>
     <w:lsdException w:unhideWhenUsed="0" w:uiPriority="70" w:semiHidden="0" w:name="Dark List Accent 6"/>
     <w:lsdException w:unhideWhenUsed="0" w:uiPriority="71" w:semiHidden="0" w:name="Colorful Shading Accent 6"/>
@@ -13038,6 +13050,7 @@
     <w:name w:val="List Number 3"/>
     <w:basedOn w:val="1"/>
     <w:unhideWhenUsed/>
+    <w:qFormat/>
     <w:uiPriority w:val="99"/>
     <w:pPr>
       <w:numPr>
@@ -13051,6 +13064,7 @@
     <w:name w:val="List 2"/>
     <w:basedOn w:val="1"/>
     <w:unhideWhenUsed/>
+    <w:qFormat/>
     <w:uiPriority w:val="99"/>
     <w:pPr>
       <w:ind w:left="720" w:hanging="360"/>
@@ -13061,6 +13075,7 @@
     <w:name w:val="List Continue"/>
     <w:basedOn w:val="1"/>
     <w:unhideWhenUsed/>
+    <w:qFormat/>
     <w:uiPriority w:val="99"/>
     <w:pPr>
       <w:spacing w:after="120"/>
@@ -13072,6 +13087,7 @@
     <w:name w:val="List Bullet 2"/>
     <w:basedOn w:val="1"/>
     <w:unhideWhenUsed/>
+    <w:qFormat/>
     <w:uiPriority w:val="99"/>
     <w:pPr>
       <w:numPr>
@@ -13086,6 +13102,7 @@
     <w:basedOn w:val="1"/>
     <w:link w:val="136"/>
     <w:unhideWhenUsed/>
+    <w:qFormat/>
     <w:uiPriority w:val="99"/>
     <w:pPr>
       <w:tabs>
@@ -13100,6 +13117,7 @@
     <w:basedOn w:val="1"/>
     <w:link w:val="135"/>
     <w:unhideWhenUsed/>
+    <w:qFormat/>
     <w:uiPriority w:val="99"/>
     <w:pPr>
       <w:tabs>
@@ -13135,6 +13153,7 @@
     <w:name w:val="List"/>
     <w:basedOn w:val="1"/>
     <w:unhideWhenUsed/>
+    <w:qFormat/>
     <w:uiPriority w:val="99"/>
     <w:pPr>
       <w:ind w:left="360" w:hanging="360"/>
@@ -13155,6 +13174,7 @@
     <w:name w:val="List Continue 2"/>
     <w:basedOn w:val="1"/>
     <w:unhideWhenUsed/>
+    <w:qFormat/>
     <w:uiPriority w:val="99"/>
     <w:pPr>
       <w:spacing w:after="120"/>
@@ -13199,6 +13219,7 @@
   <w:style w:type="table" w:styleId="33">
     <w:name w:val="Table Grid"/>
     <w:basedOn w:val="32"/>
+    <w:qFormat/>
     <w:uiPriority w:val="59"/>
     <w:pPr>
       <w:spacing w:after="0" w:line="240" w:lineRule="auto"/>
@@ -13322,6 +13343,7 @@
   <w:style w:type="table" w:styleId="35">
     <w:name w:val="Light Shading Accent 1"/>
     <w:basedOn w:val="32"/>
+    <w:qFormat/>
     <w:uiPriority w:val="60"/>
     <w:pPr>
       <w:spacing w:after="0" w:line="240" w:lineRule="auto"/>
@@ -13421,6 +13443,7 @@
   <w:style w:type="table" w:styleId="36">
     <w:name w:val="Light Shading Accent 2"/>
     <w:basedOn w:val="32"/>
+    <w:qFormat/>
     <w:uiPriority w:val="60"/>
     <w:pPr>
       <w:spacing w:after="0" w:line="240" w:lineRule="auto"/>
@@ -13520,6 +13543,7 @@
   <w:style w:type="table" w:styleId="37">
     <w:name w:val="Light Shading Accent 3"/>
     <w:basedOn w:val="32"/>
+    <w:qFormat/>
     <w:uiPriority w:val="60"/>
     <w:pPr>
       <w:spacing w:after="0" w:line="240" w:lineRule="auto"/>
@@ -13718,6 +13742,7 @@
   <w:style w:type="table" w:styleId="39">
     <w:name w:val="Light Shading Accent 5"/>
     <w:basedOn w:val="32"/>
+    <w:qFormat/>
     <w:uiPriority w:val="60"/>
     <w:pPr>
       <w:spacing w:after="0" w:line="240" w:lineRule="auto"/>
@@ -13817,6 +13842,7 @@
   <w:style w:type="table" w:styleId="40">
     <w:name w:val="Light Shading Accent 6"/>
     <w:basedOn w:val="32"/>
+    <w:qFormat/>
     <w:uiPriority w:val="60"/>
     <w:pPr>
       <w:spacing w:after="0" w:line="240" w:lineRule="auto"/>
@@ -13916,6 +13942,7 @@
   <w:style w:type="table" w:styleId="41">
     <w:name w:val="Light List"/>
     <w:basedOn w:val="32"/>
+    <w:qFormat/>
     <w:uiPriority w:val="61"/>
     <w:pPr>
       <w:spacing w:after="0" w:line="240" w:lineRule="auto"/>
@@ -14009,6 +14036,7 @@
   <w:style w:type="table" w:styleId="42">
     <w:name w:val="Light List Accent 1"/>
     <w:basedOn w:val="32"/>
+    <w:qFormat/>
     <w:uiPriority w:val="61"/>
     <w:pPr>
       <w:spacing w:after="0" w:line="240" w:lineRule="auto"/>
@@ -14102,6 +14130,7 @@
   <w:style w:type="table" w:styleId="43">
     <w:name w:val="Light List Accent 2"/>
     <w:basedOn w:val="32"/>
+    <w:qFormat/>
     <w:uiPriority w:val="61"/>
     <w:pPr>
       <w:spacing w:after="0" w:line="240" w:lineRule="auto"/>
@@ -14567,6 +14596,7 @@
   <w:style w:type="table" w:styleId="48">
     <w:name w:val="Light Grid"/>
     <w:basedOn w:val="32"/>
+    <w:qFormat/>
     <w:uiPriority w:val="62"/>
     <w:pPr>
       <w:spacing w:after="0" w:line="240" w:lineRule="auto"/>
@@ -14693,6 +14723,7 @@
   <w:style w:type="table" w:styleId="49">
     <w:name w:val="Light Grid Accent 1"/>
     <w:basedOn w:val="32"/>
+    <w:qFormat/>
     <w:uiPriority w:val="62"/>
     <w:pPr>
       <w:spacing w:after="0" w:line="240" w:lineRule="auto"/>
@@ -14819,6 +14850,7 @@
   <w:style w:type="table" w:styleId="50">
     <w:name w:val="Light Grid Accent 2"/>
     <w:basedOn w:val="32"/>
+    <w:qFormat/>
     <w:uiPriority w:val="62"/>
     <w:pPr>
       <w:spacing w:after="0" w:line="240" w:lineRule="auto"/>
@@ -14945,6 +14977,7 @@
   <w:style w:type="table" w:styleId="51">
     <w:name w:val="Light Grid Accent 3"/>
     <w:basedOn w:val="32"/>
+    <w:qFormat/>
     <w:uiPriority w:val="62"/>
     <w:pPr>
       <w:spacing w:after="0" w:line="240" w:lineRule="auto"/>
@@ -15197,6 +15230,7 @@
   <w:style w:type="table" w:styleId="53">
     <w:name w:val="Light Grid Accent 5"/>
     <w:basedOn w:val="32"/>
+    <w:qFormat/>
     <w:uiPriority w:val="62"/>
     <w:pPr>
       <w:spacing w:after="0" w:line="240" w:lineRule="auto"/>
@@ -15323,6 +15357,7 @@
   <w:style w:type="table" w:styleId="54">
     <w:name w:val="Light Grid Accent 6"/>
     <w:basedOn w:val="32"/>
+    <w:qFormat/>
     <w:uiPriority w:val="62"/>
     <w:pPr>
       <w:spacing w:after="0" w:line="240" w:lineRule="auto"/>
@@ -15449,6 +15484,7 @@
   <w:style w:type="table" w:styleId="55">
     <w:name w:val="Medium Shading 1"/>
     <w:basedOn w:val="32"/>
+    <w:qFormat/>
     <w:uiPriority w:val="63"/>
     <w:pPr>
       <w:spacing w:after="0" w:line="240" w:lineRule="auto"/>
@@ -16091,6 +16127,7 @@
   <w:style w:type="table" w:styleId="61">
     <w:name w:val="Medium Shading 1 Accent 6"/>
     <w:basedOn w:val="32"/>
+    <w:qFormat/>
     <w:uiPriority w:val="63"/>
     <w:pPr>
       <w:spacing w:after="0" w:line="240" w:lineRule="auto"/>
@@ -16363,6 +16400,7 @@
   <w:style w:type="table" w:styleId="63">
     <w:name w:val="Medium Shading 2 Accent 1"/>
     <w:basedOn w:val="32"/>
+    <w:qFormat/>
     <w:uiPriority w:val="64"/>
     <w:pPr>
       <w:spacing w:after="0" w:line="240" w:lineRule="auto"/>
@@ -16528,6 +16566,7 @@
   <w:style w:type="table" w:styleId="64">
     <w:name w:val="Medium Shading 2 Accent 2"/>
     <w:basedOn w:val="32"/>
+    <w:qFormat/>
     <w:uiPriority w:val="64"/>
     <w:pPr>
       <w:spacing w:after="0" w:line="240" w:lineRule="auto"/>
@@ -16693,6 +16732,7 @@
   <w:style w:type="table" w:styleId="65">
     <w:name w:val="Medium Shading 2 Accent 3"/>
     <w:basedOn w:val="32"/>
+    <w:qFormat/>
     <w:uiPriority w:val="64"/>
     <w:pPr>
       <w:spacing w:after="0" w:line="240" w:lineRule="auto"/>
@@ -16858,6 +16898,7 @@
   <w:style w:type="table" w:styleId="66">
     <w:name w:val="Medium Shading 2 Accent 4"/>
     <w:basedOn w:val="32"/>
+    <w:qFormat/>
     <w:uiPriority w:val="64"/>
     <w:pPr>
       <w:spacing w:after="0" w:line="240" w:lineRule="auto"/>
@@ -17023,6 +17064,7 @@
   <w:style w:type="table" w:styleId="67">
     <w:name w:val="Medium Shading 2 Accent 5"/>
     <w:basedOn w:val="32"/>
+    <w:qFormat/>
     <w:uiPriority w:val="64"/>
     <w:pPr>
       <w:spacing w:after="0" w:line="240" w:lineRule="auto"/>
@@ -17353,6 +17395,7 @@
   <w:style w:type="table" w:styleId="69">
     <w:name w:val="Medium List 1"/>
     <w:basedOn w:val="32"/>
+    <w:qFormat/>
     <w:uiPriority w:val="65"/>
     <w:pPr>
       <w:spacing w:after="0" w:line="240" w:lineRule="auto"/>
@@ -17533,6 +17576,7 @@
   <w:style w:type="table" w:styleId="71">
     <w:name w:val="Medium List 1 Accent 2"/>
     <w:basedOn w:val="32"/>
+    <w:qFormat/>
     <w:uiPriority w:val="65"/>
     <w:pPr>
       <w:spacing w:after="0" w:line="240" w:lineRule="auto"/>
@@ -17983,6 +18027,7 @@
   <w:style w:type="table" w:styleId="76">
     <w:name w:val="Medium List 2"/>
     <w:basedOn w:val="32"/>
+    <w:qFormat/>
     <w:uiPriority w:val="66"/>
     <w:pPr>
       <w:spacing w:after="0" w:line="240" w:lineRule="auto"/>
@@ -18886,6 +18931,7 @@
   <w:style w:type="table" w:styleId="83">
     <w:name w:val="Medium Grid 1"/>
     <w:basedOn w:val="32"/>
+    <w:qFormat/>
     <w:uiPriority w:val="67"/>
     <w:pPr>
       <w:spacing w:after="0" w:line="240" w:lineRule="auto"/>
@@ -18955,6 +19001,7 @@
   <w:style w:type="table" w:styleId="84">
     <w:name w:val="Medium Grid 1 Accent 1"/>
     <w:basedOn w:val="32"/>
+    <w:qFormat/>
     <w:uiPriority w:val="67"/>
     <w:pPr>
       <w:spacing w:after="0" w:line="240" w:lineRule="auto"/>
@@ -19093,6 +19140,7 @@
   <w:style w:type="table" w:styleId="86">
     <w:name w:val="Medium Grid 1 Accent 3"/>
     <w:basedOn w:val="32"/>
+    <w:qFormat/>
     <w:uiPriority w:val="67"/>
     <w:pPr>
       <w:spacing w:after="0" w:line="240" w:lineRule="auto"/>
@@ -19300,6 +19348,7 @@
   <w:style w:type="table" w:styleId="89">
     <w:name w:val="Medium Grid 1 Accent 6"/>
     <w:basedOn w:val="32"/>
+    <w:qFormat/>
     <w:uiPriority w:val="67"/>
     <w:pPr>
       <w:spacing w:after="0" w:line="240" w:lineRule="auto"/>
@@ -19369,6 +19418,7 @@
   <w:style w:type="table" w:styleId="90">
     <w:name w:val="Medium Grid 2"/>
     <w:basedOn w:val="32"/>
+    <w:qFormat/>
     <w:uiPriority w:val="68"/>
     <w:pPr>
       <w:spacing w:after="0" w:line="240" w:lineRule="auto"/>
@@ -19661,6 +19711,7 @@
   <w:style w:type="table" w:styleId="92">
     <w:name w:val="Medium Grid 2 Accent 2"/>
     <w:basedOn w:val="32"/>
+    <w:qFormat/>
     <w:uiPriority w:val="68"/>
     <w:pPr>
       <w:spacing w:after="0" w:line="240" w:lineRule="auto"/>
@@ -19953,6 +20004,7 @@
   <w:style w:type="table" w:styleId="94">
     <w:name w:val="Medium Grid 2 Accent 4"/>
     <w:basedOn w:val="32"/>
+    <w:qFormat/>
     <w:uiPriority w:val="68"/>
     <w:pPr>
       <w:spacing w:after="0" w:line="240" w:lineRule="auto"/>
@@ -20099,6 +20151,7 @@
   <w:style w:type="table" w:styleId="95">
     <w:name w:val="Medium Grid 2 Accent 5"/>
     <w:basedOn w:val="32"/>
+    <w:qFormat/>
     <w:uiPriority w:val="68"/>
     <w:pPr>
       <w:spacing w:after="0" w:line="240" w:lineRule="auto"/>
@@ -20245,6 +20298,7 @@
   <w:style w:type="table" w:styleId="96">
     <w:name w:val="Medium Grid 2 Accent 6"/>
     <w:basedOn w:val="32"/>
+    <w:qFormat/>
     <w:uiPriority w:val="68"/>
     <w:pPr>
       <w:spacing w:after="0" w:line="240" w:lineRule="auto"/>

</xml_diff>